<commit_message>
Translate Annex №25 Exam regulations & Assessment to Uzbek
Complete translation of the ministerial order on student knowledge
monitoring and assessment system in higher education institutions
from English to Uzbek language, including all chapters, articles,
and comparison tables.

Co-Authored-By: Claude Opus 4.6 <noreply@anthropic.com>
Claude-Session: https://claude.ai/code/session_01N9ZP28hxEfPoWHf2qaE8QM
</commit_message>
<xml_diff>
--- a/Computer Engineering, Software Engineering, Computer systems & their softwares/Annexes/Annex №25 Exam regulations & Assesment.docx
+++ b/Computer Engineering, Software Engineering, Computer systems & their softwares/Annexes/Annex №25 Exam regulations & Assesment.docx
@@ -23,7 +23,7 @@
           <w:szCs w:val="24"/>
           <w:lang w:eastAsia="uz-Cyrl-UZ"/>
         </w:rPr>
-        <w:t>Order of the Minister of Higher and Secondary Specialized Education of the Republic of Uzbekistan, registered on 26.09.2018, registration number 3069</w:t>
+        <w:t>O'zbekiston Respublikasi Oliy va o'rta maxsus ta'lim vazirining 26.09.2018 yilda ro'yxatdan o'tgan, ro'yxatga olish raqami 3069-sonli buyrug'i</w:t>
       </w:r>
     </w:p>
     <w:p>
@@ -47,7 +47,7 @@
           <w:szCs w:val="24"/>
           <w:lang w:eastAsia="uz-Cyrl-UZ"/>
         </w:rPr>
-        <w:t>Effective date</w:t>
+        <w:t>Kuchga kirish sanasi</w:t>
       </w:r>
     </w:p>
     <w:p>
@@ -95,7 +95,7 @@
           <w:szCs w:val="24"/>
           <w:lang w:eastAsia="uz-Cyrl-UZ"/>
         </w:rPr>
-        <w:t>Additional information</w:t>
+        <w:t>Qo'shimcha ma'lumot</w:t>
       </w:r>
     </w:p>
     <w:p>
@@ -119,7 +119,7 @@
           <w:szCs w:val="24"/>
           <w:lang w:eastAsia="uz-Cyrl-UZ"/>
         </w:rPr>
-        <w:t>Share</w:t>
+        <w:t>Ulashish</w:t>
       </w:r>
     </w:p>
     <w:tbl>
@@ -216,7 +216,7 @@
           <w:szCs w:val="24"/>
           <w:lang w:eastAsia="uz-Cyrl-UZ"/>
         </w:rPr>
-        <w:t>Minister of Higher and Secondary Specialized Education of the Republic of Uzbekistan</w:t>
+        <w:t>O'zbekiston Respublikasi Oliy va o'rta maxsus ta'lim vazirining</w:t>
       </w:r>
     </w:p>
     <w:p>
@@ -243,7 +243,7 @@
           <w:szCs w:val="24"/>
           <w:lang w:eastAsia="uz-Cyrl-UZ"/>
         </w:rPr>
-        <w:t>order</w:t>
+        <w:t>buyrug'i</w:t>
       </w:r>
     </w:p>
     <w:p>
@@ -274,7 +274,7 @@
           <w:szCs w:val="24"/>
           <w:lang w:eastAsia="uz-Cyrl-UZ"/>
         </w:rPr>
-        <w:t xml:space="preserve">On approval of </w:t>
+        <w:t>Oliy ta'lim tashkilotlarida talabalar bilimini nazorat qilish va baholash tizimi to'g'risidagi Nizomni tasdiqlash haqida</w:t>
       </w:r>
       <w:hyperlink r:id="rId4" w:anchor="3777183" w:history="1">
         <w:r>
@@ -303,7 +303,6 @@
           <w:szCs w:val="24"/>
           <w:lang w:eastAsia="uz-Cyrl-UZ"/>
         </w:rPr>
-        <w:t xml:space="preserve"> on the system of monitoring and assessing student knowledge in higher education institutions</w:t>
       </w:r>
     </w:p>
     <w:p>
@@ -332,7 +331,7 @@
           <w:szCs w:val="24"/>
           <w:lang w:eastAsia="uz-Cyrl-UZ"/>
         </w:rPr>
-        <w:t>[Registered by the Ministry of Justice of the Republic of Uzbekistan on September 26, 2018, registration number 3069]</w:t>
+        <w:t>[O'zbekiston Respublikasi Adliya vazirligi tomonidan 2018 yil 26 sentyabrda ro'yxatga olingan, ro'yxatga olish raqami 3069]</w:t>
       </w:r>
     </w:p>
     <w:p>
@@ -371,7 +370,7 @@
           <w:szCs w:val="24"/>
           <w:lang w:eastAsia="uz-Cyrl-UZ"/>
         </w:rPr>
-        <w:t xml:space="preserve"> of the President of the Republic of Uzbekistan No. PP-3775 dated June 5, 2018 "On additional measures to improve the quality of education in higher educational institutions and ensure their active participation in the wide-ranging reforms being implemented in the country", I order:</w:t>
+        <w:t>O'zbekiston Respublikasi Prezidentining 2018 yil 5 iyundagi "Oliy ta'lim muassasalarida ta'lim sifatini oshirish va ularning mamlakatda amalga oshirilayotgan keng ko'lamli islohotlarda faol ishtirokini ta'minlash bo'yicha qo'shimcha chora-tadbirlar to'g'risida"gi PQ-3775-sonli qaroriga muvofiq buyuraman:</w:t>
       </w:r>
     </w:p>
     <w:p>
@@ -397,7 +396,7 @@
           <w:szCs w:val="24"/>
           <w:lang w:eastAsia="uz-Cyrl-UZ"/>
         </w:rPr>
-        <w:t xml:space="preserve">1. The regulation on the system of monitoring and evaluating student knowledge in higher education organizations should be approved in accordance with </w:t>
+        <w:t>1. Oliy ta'lim tashkilotlarida talabalar bilimini nazorat qilish va baholash tizimi to'g'risidagi Nizom ilovaga muvofiq tasdiqlansin.</w:t>
       </w:r>
       <w:hyperlink r:id="rId6" w:anchor="3920495" w:history="1">
         <w:r>
@@ -420,7 +419,6 @@
           <w:szCs w:val="24"/>
           <w:lang w:eastAsia="uz-Cyrl-UZ"/>
         </w:rPr>
-        <w:t xml:space="preserve"> .</w:t>
       </w:r>
     </w:p>
     <w:p>
@@ -446,7 +444,7 @@
           <w:szCs w:val="24"/>
           <w:lang w:eastAsia="uz-Cyrl-UZ"/>
         </w:rPr>
-        <w:t>2. This order shall enter into force from the date of its official publication.</w:t>
+        <w:t>2. Ushbu buyruq rasmiy e'lon qilingan kundan boshlab kuchga kiradi.</w:t>
       </w:r>
     </w:p>
     <w:p>
@@ -475,7 +473,7 @@
           <w:szCs w:val="24"/>
           <w:lang w:eastAsia="uz-Cyrl-UZ"/>
         </w:rPr>
-        <w:t>Minister I. MAJIDOV</w:t>
+        <w:t>Vazir I. MAJIDOV</w:t>
       </w:r>
     </w:p>
     <w:p>
@@ -500,7 +498,7 @@
           <w:szCs w:val="24"/>
           <w:lang w:eastAsia="uz-Cyrl-UZ"/>
         </w:rPr>
-        <w:t>Tashkent city,</w:t>
+        <w:t>Toshkent shahri,</w:t>
       </w:r>
     </w:p>
     <w:p>
@@ -525,7 +523,7 @@
           <w:szCs w:val="24"/>
           <w:lang w:eastAsia="uz-Cyrl-UZ"/>
         </w:rPr>
-        <w:t>August 9, 2018,</w:t>
+        <w:t>2018 yil 9 avgust,</w:t>
       </w:r>
     </w:p>
     <w:p>
@@ -550,7 +548,7 @@
           <w:szCs w:val="24"/>
           <w:lang w:eastAsia="uz-Cyrl-UZ"/>
         </w:rPr>
-        <w:t>Issue 19-2018</w:t>
+        <w:t>19-2018-son</w:t>
       </w:r>
     </w:p>
     <w:p>
@@ -710,8 +708,7 @@
           <w:szCs w:val="24"/>
           <w:lang w:eastAsia="uz-Cyrl-UZ"/>
         </w:rPr>
-        <w:lastRenderedPageBreak/>
-        <w:t xml:space="preserve">APPENDIX </w:t>
+        <w:t>O'zbekiston Respublikasi Oliy va o'rta maxsus ta'lim vazirining 2018 yil 9 avgustdagi 19-2018-sonli buyrug'iga ILOVA</w:t>
       </w:r>
       <w:hyperlink r:id="rId7" w:history="1">
         <w:r>
@@ -734,7 +731,6 @@
           <w:szCs w:val="24"/>
           <w:lang w:eastAsia="uz-Cyrl-UZ"/>
         </w:rPr>
-        <w:t xml:space="preserve"> of the Minister of Higher and Secondary Specialized Education of the Republic of Uzbekistan No. 19-2018 dated August 9, 2018</w:t>
       </w:r>
       <w:r>
         <w:rPr>
@@ -744,7 +740,6 @@
           <w:szCs w:val="24"/>
           <w:lang w:eastAsia="uz-Cyrl-UZ"/>
         </w:rPr>
-        <w:br/>
       </w:r>
     </w:p>
     <w:p>
@@ -773,7 +768,7 @@
           <w:szCs w:val="24"/>
           <w:lang w:eastAsia="uz-Cyrl-UZ"/>
         </w:rPr>
-        <w:t>On the system of monitoring and evaluating student knowledge in higher education organizations</w:t>
+        <w:t>Oliy ta'lim tashkilotlarida talabalar bilimini nazorat qilish va baholash tizimi to'g'risida</w:t>
       </w:r>
     </w:p>
     <w:p>
@@ -791,20 +786,9 @@
           <w:lang w:eastAsia="uz-Cyrl-UZ"/>
         </w:rPr>
       </w:pPr>
-      <w:hyperlink r:id="rId8" w:anchor="3777183" w:history="1">
-        <w:r>
-          <w:rPr>
-            <w:rFonts w:ascii="Arial" w:eastAsia="Times New Roman" w:hAnsi="Arial" w:cs="Arial"/>
-            <w:caps/>
-            <w:color w:val="008080"/>
-            <w:sz w:val="24"/>
-            <w:szCs w:val="24"/>
-            <w:u w:val="single"/>
-            <w:lang w:eastAsia="uz-Cyrl-UZ"/>
-          </w:rPr>
-          <w:t>REGULATION</w:t>
-        </w:r>
-      </w:hyperlink>
+      <w:r>
+        <w:t>NIZOM</w:t>
+      </w:r>
     </w:p>
     <w:p>
       <w:pPr>
@@ -842,7 +826,7 @@
           <w:szCs w:val="24"/>
           <w:lang w:eastAsia="uz-Cyrl-UZ"/>
         </w:rPr>
-        <w:t xml:space="preserve"> of the President of the Republic of Uzbekistan No. PP-3775 dated June 5, 2018 "On additional measures to improve the quality of education in higher education institutions and ensure their active participation in the large-scale reforms being implemented in the country. "</w:t>
+        <w:t>Mazkur Nizom O'zbekiston Respublikasi Prezidentining 2018 yil 5 iyundagi "Oliy ta'lim muassasalarida ta'lim sifatini oshirish va ularning mamlakatda amalga oshirilayotgan keng ko'lamli islohotlarda faol ishtirokini ta'minlash bo'yicha qo'shimcha chora-tadbirlar to'g'risida"gi PQ-3775-sonli qaroriga muvofiq oliy ta'lim muassasalarida talabalar bilimini nazorat qilish va baholash tizimini belgilaydi.</w:t>
       </w:r>
     </w:p>
     <w:p>
@@ -871,7 +855,7 @@
           <w:szCs w:val="24"/>
           <w:lang w:eastAsia="uz-Cyrl-UZ"/>
         </w:rPr>
-        <w:t>Chapter 1. General rules</w:t>
+        <w:t>1-bob. Umumiy qoidalar</w:t>
       </w:r>
     </w:p>
     <w:p>
@@ -897,7 +881,7 @@
           <w:szCs w:val="24"/>
           <w:lang w:eastAsia="uz-Cyrl-UZ"/>
         </w:rPr>
-        <w:t>1. These Regulations apply to the monitoring and assessment of the knowledge of students admitted to higher education institutions in the 2018-2019 academic year, as well as in subsequent academic years.</w:t>
+        <w:t>1. Mazkur Nizom 2018-2019 o'quv yilida, shuningdek keyingi o'quv yillarida oliy ta'lim muassasalariga qabul qilingan talabalar bilimini nazorat qilish va baholashga nisbatan qo'llaniladi.</w:t>
       </w:r>
     </w:p>
     <w:p>
@@ -923,7 +907,7 @@
           <w:szCs w:val="24"/>
           <w:lang w:eastAsia="uz-Cyrl-UZ"/>
         </w:rPr>
-        <w:t>2. The requirements of this Regulation do not apply to the control and assessment of student knowledge in higher education institutions based on the module system of the educational process in accordance with the legislation.</w:t>
+        <w:t>2. Mazkur Nizom talablari qonunchilikka muvofiq ta'lim jarayonining modul tizimiga asoslangan oliy ta'lim muassasalarida talabalar bilimini nazorat qilish va baholashga nisbatan qo'llanilmaydi.</w:t>
       </w:r>
     </w:p>
     <w:p>
@@ -949,7 +933,7 @@
           <w:szCs w:val="24"/>
           <w:lang w:eastAsia="uz-Cyrl-UZ"/>
         </w:rPr>
-        <w:t>3. Students must be familiarized with the requirements of these Regulations during the first lesson by professors and teachers of higher education institutions.</w:t>
+        <w:t>3. Talabalar mazkur Nizom talablari bilan oliy ta'lim muassasalari professor-o'qituvchilari tomonidan birinchi darsda tanishtirilishi shart.</w:t>
       </w:r>
     </w:p>
     <w:p>
@@ -975,7 +959,7 @@
           <w:szCs w:val="24"/>
           <w:lang w:eastAsia="uz-Cyrl-UZ"/>
         </w:rPr>
-        <w:t>4. The assessment criteria specified in this Regulation are used for the assessment of students' knowledge of the qualification practice, coursework, science (interdisciplinary) state certification, graduation qualification work, as well as scientific-research and scientific-pedagogical works and master's thesis at the master's level.</w:t>
+        <w:t>4. Mazkur Nizomda belgilangan baholash mezonlari talabalarning malakaviy amaliyot, kurs ishi, fan (fanlararo) davlat attestatsiyasi, bitiruv malakaviy ishi bilimlarini baholash, shuningdek magistratura bosqichida ilmiy-tadqiqot va ilmiy-pedagogik ishlar hamda magistrlik dissertatsiyasini baholash uchun qo'llaniladi.</w:t>
       </w:r>
     </w:p>
     <w:p>
@@ -1004,7 +988,7 @@
           <w:szCs w:val="24"/>
           <w:lang w:eastAsia="uz-Cyrl-UZ"/>
         </w:rPr>
-        <w:t>Chapter 2. Types of control and assessment criteria</w:t>
+        <w:t>2-bob. Nazorat turlari va baholash mezonlari</w:t>
       </w:r>
     </w:p>
     <w:p>
@@ -1033,7 +1017,7 @@
           <w:szCs w:val="24"/>
           <w:lang w:eastAsia="uz-Cyrl-UZ"/>
         </w:rPr>
-        <w:t>§ 1. Types of control</w:t>
+        <w:t>§ 1. Nazorat turlari</w:t>
       </w:r>
     </w:p>
     <w:p>
@@ -1059,7 +1043,7 @@
           <w:szCs w:val="24"/>
           <w:lang w:eastAsia="uz-Cyrl-UZ"/>
         </w:rPr>
-        <w:t>5. Control of student knowledge in higher education organizations is carried out by means of intermediate and final types of control.</w:t>
+        <w:t>5. Oliy ta'lim tashkilotlarida talabalar bilimini nazorat qilish oraliq va yakuniy nazorat turlari orqali amalga oshiriladi.</w:t>
       </w:r>
     </w:p>
     <w:p>
@@ -1085,7 +1069,7 @@
           <w:szCs w:val="24"/>
           <w:lang w:eastAsia="uz-Cyrl-UZ"/>
         </w:rPr>
-        <w:t>6. Mid-term supervision is conducted during the course of the semester in order to assess the student's knowledge and practical skills after the end of the relevant section of the work science program.</w:t>
+        <w:t>6. Oraliq nazorat semestr davomida fan ishchi dasturining tegishli bo'limi tugagandan so'ng talabaning bilim va amaliy ko'nikmalarini baholash maqsadida o'tkaziladi.</w:t>
       </w:r>
     </w:p>
     <w:p>
@@ -1111,7 +1095,7 @@
           <w:szCs w:val="24"/>
           <w:lang w:eastAsia="uz-Cyrl-UZ"/>
         </w:rPr>
-        <w:t>7. The type of intermediate control can be conducted up to 2 times for each subject depending on the nature of the subject.</w:t>
+        <w:t>7. Oraliq nazorat turi fanning xususiyatiga qarab har bir fan bo'yicha 2 martagacha o'tkazilishi mumkin.</w:t>
       </w:r>
     </w:p>
     <w:p>
@@ -1137,8 +1121,7 @@
           <w:szCs w:val="24"/>
           <w:lang w:eastAsia="uz-Cyrl-UZ"/>
         </w:rPr>
-        <w:lastRenderedPageBreak/>
-        <w:t>The form and duration of the intermediate supervision is determined by the relevant department based on the nature of the subject and the hours allocated to the subject.</w:t>
+        <w:t>Oraliq nazoratning shakli va davomiyligi fanning xususiyati va fanga ajratilgan soatlar asosida tegishli kafedra tomonidan belgilanadi.</w:t>
       </w:r>
     </w:p>
     <w:p>
@@ -1164,7 +1147,7 @@
           <w:szCs w:val="24"/>
           <w:lang w:eastAsia="uz-Cyrl-UZ"/>
         </w:rPr>
-        <w:t>8. Assignments of the intermediate control type are developed by professors and teachers of the relevant department and approved by the head of the department.</w:t>
+        <w:t>8. Oraliq nazorat turi topshiriqlari tegishli kafedra professor-o'qituvchilari tomonidan ishlab chiqiladi va kafedra mudiri tomonidan tasdiqlanadi.</w:t>
       </w:r>
     </w:p>
     <w:p>
@@ -1190,7 +1173,7 @@
           <w:szCs w:val="24"/>
           <w:lang w:eastAsia="uz-Cyrl-UZ"/>
         </w:rPr>
-        <w:t>9. During the semester, the type of intermediate control is not conducted for subjects that are less than 2 academic hours per week (4 academic hours in medical higher education institutions).</w:t>
+        <w:t>9. Semestr davomida haftasiga 2 soatdan kam (tibbiyot oliy ta'lim muassasalarida 4 soatdan kam) bo'lgan fanlar bo'yicha oraliq nazorat turi o'tkazilmaydi.</w:t>
       </w:r>
     </w:p>
     <w:p>
@@ -1216,7 +1199,7 @@
           <w:szCs w:val="24"/>
           <w:lang w:eastAsia="uz-Cyrl-UZ"/>
         </w:rPr>
-        <w:t xml:space="preserve">10. The student's performance of practical, seminar, laboratory classes and independent educational assignments, as well as his activity in these classes, is evaluated by the science teacher. The assessment is carried out based on the criteria provided for </w:t>
+        <w:t>10. Talabaning amaliy, seminar, laboratoriya mashg'ulotlari va mustaqil ta'lim topshiriqlarini bajarishi, shuningdek ushbu mashg'ulotlardagi faolligi fan o'qituvchisi tomonidan baholanadi. Baholash mazkur Nizomning 15-bandida nazarda tutilgan mezonlar asosida amalga oshiriladi.</w:t>
       </w:r>
       <w:hyperlink r:id="rId10" w:anchor="3920571" w:history="1">
         <w:r>
@@ -1239,7 +1222,6 @@
           <w:szCs w:val="24"/>
           <w:lang w:eastAsia="uz-Cyrl-UZ"/>
         </w:rPr>
-        <w:t xml:space="preserve"> of this Regulation .</w:t>
       </w:r>
     </w:p>
     <w:p>
@@ -1265,7 +1247,7 @@
           <w:szCs w:val="24"/>
           <w:lang w:eastAsia="uz-Cyrl-UZ"/>
         </w:rPr>
-        <w:t>When evaluating a student according to the type of midterm control, his grades received during the training sessions are taken into account.</w:t>
+        <w:t>Talabani oraliq nazorat turi bo'yicha baholashda uning o'quv mashg'ulotlari davomida olgan baholari hisobga olinadi.</w:t>
       </w:r>
     </w:p>
     <w:p>
@@ -1291,7 +1273,7 @@
           <w:szCs w:val="24"/>
           <w:lang w:eastAsia="uz-Cyrl-UZ"/>
         </w:rPr>
-        <w:t>11. The type of final control is conducted at the end of the semester (at the end of the subject in medical higher education institutions) in order to determine the level of mastering of theoretical knowledge and practical skills of the student in the relevant subject.</w:t>
+        <w:t>11. Yakuniy nazorat turi semestr oxirida (tibbiyot oliy ta'lim muassasalarida fan tugagandan so'ng) talabaning tegishli fan bo'yicha nazariy bilim va amaliy ko'nikmalarni o'zlashtirish darajasini aniqlash maqsadida o'tkaziladi.</w:t>
       </w:r>
     </w:p>
     <w:p>
@@ -1317,7 +1299,7 @@
           <w:szCs w:val="24"/>
           <w:lang w:eastAsia="uz-Cyrl-UZ"/>
         </w:rPr>
-        <w:t>12. The form of conducting the final control type is determined by the department of the relevant subject.</w:t>
+        <w:t>12. Yakuniy nazorat turini o'tkazish shakli tegishli fan kafedrasi tomonidan belgilanadi.</w:t>
       </w:r>
     </w:p>
     <w:p>
@@ -1343,7 +1325,7 @@
           <w:szCs w:val="24"/>
           <w:lang w:eastAsia="uz-Cyrl-UZ"/>
         </w:rPr>
-        <w:t>13. The final examination is carried out in accordance with the schedule of final examinations, which is developed by the dean of the relevant faculty or educational and methodological department of higher education institutions and approved by the vice-rector for academic affairs.</w:t>
+        <w:t>13. Yakuniy nazorat oliy ta'lim muassasalarining tegishli fakultet dekani yoki o'quv-uslubiy bo'limi tomonidan ishlab chiqilgan va o'quv ishlari bo'yicha prorektor tomonidan tasdiqlangan yakuniy imtihonlar jadvali bo'yicha amalga oshiriladi.</w:t>
       </w:r>
     </w:p>
     <w:p>
@@ -1369,7 +1351,7 @@
           <w:szCs w:val="24"/>
           <w:lang w:eastAsia="uz-Cyrl-UZ"/>
         </w:rPr>
-        <w:t>14. In higher medical education institutions, intermediate and final control types may be conducted in the form of objective systematized clinical tests or objective systematized exams.</w:t>
+        <w:t>14. Oliy tibbiyot ta'lim muassasalarida oraliq va yakuniy nazorat turlari ob'ektiv tizimlashtirilgan klinik testlar yoki ob'ektiv tizimlashtirilgan imtihonlar shaklida o'tkazilishi mumkin.</w:t>
       </w:r>
     </w:p>
     <w:p>
@@ -1398,7 +1380,7 @@
           <w:szCs w:val="24"/>
           <w:lang w:eastAsia="uz-Cyrl-UZ"/>
         </w:rPr>
-        <w:t>§ 2. Criteria for evaluating student knowledge</w:t>
+        <w:t>§ 2. Talabalar bilimini baholash mezonlari</w:t>
       </w:r>
     </w:p>
     <w:p>
@@ -1424,7 +1406,7 @@
           <w:szCs w:val="24"/>
           <w:lang w:eastAsia="uz-Cyrl-UZ"/>
         </w:rPr>
-        <w:t>15. Students' knowledge based on the following criteria:</w:t>
+        <w:t>15. Talabalar bilimi quyidagi mezonlar asosida baholanadi:</w:t>
       </w:r>
     </w:p>
     <w:p>
@@ -1450,7 +1432,7 @@
           <w:szCs w:val="24"/>
           <w:lang w:eastAsia="uz-Cyrl-UZ"/>
         </w:rPr>
-        <w:t>When the student is considered to be able to make independent conclusions and decisions, think creatively, observe independently, apply the knowledge gained in practice, understand, know, express, and narrate the essence of the subject (subject), and has an idea about the subject (subject) - 5 (excellent) grade;</w:t>
+        <w:t>Talaba fan (mavzu) mohiyatini mustaqil xulosa va qarorlar qabul qila olishi, ijodiy fikrlay olishi, mustaqil kuzatishlar o'tkaza olishi, olgan bilimlarini amaliyotda qo'llay olishi, tushunishi, bilishi, ifodalay olishi va bayon qila olishi hamda fan (mavzu) haqida tasavvurga ega ekanligi aniqlanganda — 5 (a'lo) baho;</w:t>
       </w:r>
     </w:p>
     <w:p>
@@ -1476,7 +1458,7 @@
           <w:szCs w:val="24"/>
           <w:lang w:eastAsia="uz-Cyrl-UZ"/>
         </w:rPr>
-        <w:t xml:space="preserve">When the student is considered to be able to conduct independent observations, apply the knowledge gained in practice, understand, know, express, and narrate the </w:t>
+        <w:t>Talaba mustaqil kuzatishlar o'tkaza olishi, olgan bilimlarini amaliyotda qo'llay olishi, fan (mavzu) mohiyatini tushunishi, bilishi, ifodalay olishi va bayon qila olishi hamda fan (mavzu) haqida tasavvurga ega ekanligi aniqlanganda — 4 (yaxshi) baho;</w:t>
       </w:r>
       <w:r>
         <w:rPr>
@@ -1486,8 +1468,6 @@
           <w:szCs w:val="24"/>
           <w:lang w:eastAsia="uz-Cyrl-UZ"/>
         </w:rPr>
-        <w:lastRenderedPageBreak/>
-        <w:t>essence of the subject (subject), and has an idea of ​​the subject (subject) - a grade of 4 (good);</w:t>
       </w:r>
     </w:p>
     <w:p>
@@ -1513,7 +1493,7 @@
           <w:szCs w:val="24"/>
           <w:lang w:eastAsia="uz-Cyrl-UZ"/>
         </w:rPr>
-        <w:t>When the student is able to apply the knowledge he/she has gained in practice, understands, knows, can express, and narrate the essence of the subject (subject), and has an idea of ​​the subject (subject) - grade 3 (satisfactory);</w:t>
+        <w:t>Talaba olgan bilimlarini amaliyotda qo'llay olishi, fan (mavzu) mohiyatini tushunishi, bilishi, ifodalay olishi va bayon qila olishi hamda fan (mavzu) haqida tasavvurga ega ekanligi aniqlanganda — 3 (qoniqarli) baho;</w:t>
       </w:r>
     </w:p>
     <w:p>
@@ -1539,7 +1519,7 @@
           <w:szCs w:val="24"/>
           <w:lang w:eastAsia="uz-Cyrl-UZ"/>
         </w:rPr>
-        <w:t>If the student is found to have not mastered the subject program, does not understand the essence of the subject (subject), and does not have an idea about the subject (subject), he/she will be given a grade of 2 (unsatisfactory).</w:t>
+        <w:t>Talaba fan dasturini o'zlashtirmagan, fan (mavzu) mohiyatini tushunmagan va fan (mavzu) haqida tasavvurga ega emasligi aniqlanganda — 2 (qoniqarsiz) baho qo'yiladi.</w:t>
       </w:r>
     </w:p>
     <w:p>
@@ -1565,7 +1545,7 @@
           <w:szCs w:val="24"/>
           <w:lang w:eastAsia="uz-Cyrl-UZ"/>
         </w:rPr>
-        <w:t>16. The content of the tasks created for conducting the types of supervision must provide an opportunity to objectively and accurately assess the student's learning.</w:t>
+        <w:t>16. Nazorat turlarini o'tkazish uchun yaratilgan topshiriqlarning mazmuni talabaning o'zlashtirishini ob'ektiv va aniq baholash imkoniyatini ta'minlashi kerak.</w:t>
       </w:r>
     </w:p>
     <w:p>
@@ -1594,7 +1574,7 @@
           <w:szCs w:val="24"/>
           <w:lang w:eastAsia="uz-Cyrl-UZ"/>
         </w:rPr>
-        <w:t>Chapter 3. Assessment of student knowledge</w:t>
+        <w:t>3-bob. Talabalar bilimini baholash</w:t>
       </w:r>
     </w:p>
     <w:p>
@@ -1620,7 +1600,7 @@
           <w:szCs w:val="24"/>
           <w:lang w:eastAsia="uz-Cyrl-UZ"/>
         </w:rPr>
-        <w:t>17. Assessment of students' knowledge is carried out in a 5-grade system.</w:t>
+        <w:t>17. Talabalar bilimini baholash 5 balli tizimda amalga oshiriladi.</w:t>
       </w:r>
     </w:p>
     <w:p>
@@ -1646,7 +1626,7 @@
           <w:szCs w:val="24"/>
           <w:lang w:eastAsia="uz-Cyrl-UZ"/>
         </w:rPr>
-        <w:t>18. Conducting an intermediate type of control and assessing the student's knowledge during this type of control is carried out by the professor-teacher who conducts training sessions in the relevant subject.</w:t>
+        <w:t>18. Oraliq nazorat turini o'tkazish va ushbu nazorat turi davomida talaba bilimini baholash tegishli fanda o'quv mashg'ulotlarini olib boruvchi professor-o'qituvchi tomonidan amalga oshiriladi.</w:t>
       </w:r>
     </w:p>
     <w:p>
@@ -1672,7 +1652,7 @@
           <w:szCs w:val="24"/>
           <w:lang w:eastAsia="uz-Cyrl-UZ"/>
         </w:rPr>
-        <w:t>The final examination and assessment of the student's knowledge during this examination are carried out by a professor who does not conduct the training sessions.</w:t>
+        <w:t>Yakuniy imtihonni o'tkazish va ushbu imtihon davomida talaba bilimini baholash o'quv mashg'ulotlarini olib bormagan professor tomonidan amalga oshiriladi.</w:t>
       </w:r>
     </w:p>
     <w:p>
@@ -1698,7 +1678,7 @@
           <w:szCs w:val="24"/>
           <w:lang w:eastAsia="uz-Cyrl-UZ"/>
         </w:rPr>
-        <w:t>A professor who has conducted training sessions in the relevant subject is prohibited from participating in the final examination.</w:t>
+        <w:t>Tegishli fanda o'quv mashg'ulotlarini olib borgan professorning yakuniy imtihonda qatnashishi taqiqlanadi.</w:t>
       </w:r>
     </w:p>
     <w:p>
@@ -1724,7 +1704,7 @@
           <w:szCs w:val="24"/>
           <w:lang w:eastAsia="uz-Cyrl-UZ"/>
         </w:rPr>
-        <w:t>Professors and teachers of other higher education institutions may be involved in the conduct of the final type of supervision based on an agreement.</w:t>
+        <w:t>Yakuniy nazorat turini o'tkazishga shartnoma asosida boshqa oliy ta'lim muassasalarining professor-o'qituvchilari jalb etilishi mumkin.</w:t>
       </w:r>
     </w:p>
     <w:p>
@@ -1750,7 +1730,7 @@
           <w:szCs w:val="24"/>
           <w:lang w:eastAsia="uz-Cyrl-UZ"/>
         </w:rPr>
-        <w:t>19. Conducting intermediate and final control types in medical higher education organizations, as well as evaluating students' knowledge, is carried out by a commission organized by the head of the relevant department.</w:t>
+        <w:t>19. Tibbiyot oliy ta'lim tashkilotlarida oraliq va yakuniy nazorat turlarini o'tkazish, shuningdek talabalar bilimini baholash tegishli kafedra mudiri tomonidan tashkil etilgan komissiya tomonidan amalga oshiriladi.</w:t>
       </w:r>
     </w:p>
     <w:p>
@@ -1776,7 +1756,7 @@
           <w:szCs w:val="24"/>
           <w:lang w:eastAsia="uz-Cyrl-UZ"/>
         </w:rPr>
-        <w:t>The composition of the commission is formed from professors and teachers of relevant subjects and experts in the field.</w:t>
+        <w:t>Komissiya tarkibi tegishli fanlar professor-o'qituvchilari va soha mutaxassislaridan shakllantiriladi.</w:t>
       </w:r>
     </w:p>
     <w:p>
@@ -1802,7 +1782,7 @@
           <w:szCs w:val="24"/>
           <w:lang w:eastAsia="uz-Cyrl-UZ"/>
         </w:rPr>
-        <w:t>Experts from other organizations may be involved in the commission by agreement.</w:t>
+        <w:t>Kelishuv asosida komissiyaga boshqa tashkilotlarning mutaxassislari jalb etilishi mumkin.</w:t>
       </w:r>
     </w:p>
     <w:p>
@@ -1828,7 +1808,7 @@
           <w:szCs w:val="24"/>
           <w:lang w:eastAsia="uz-Cyrl-UZ"/>
         </w:rPr>
-        <w:t>20. The types of control in the higher education organization are constantly studied by the education quality control department of the relevant higher education organization. In cases where it is determined that the procedure for conducting the types of control is violated, the results of the conducted types of control may be canceled and the corresponding type of control may be re-conducted.</w:t>
+        <w:t>20. Oliy ta'lim tashkilotida nazorat turlari tegishli oliy ta'lim tashkilotining ta'lim sifatini nazorat qilish bo'limi tomonidan doimiy ravishda o'rganiladi. Nazorat turlarini o'tkazish tartibi buzilganligi aniqlangan hollarda o'tkazilgan nazorat turlari natijalari bekor qilinishi va tegishli nazorat turi qayta o'tkazilishi mumkin.</w:t>
       </w:r>
     </w:p>
     <w:p>
@@ -1854,7 +1834,7 @@
           <w:szCs w:val="24"/>
           <w:lang w:eastAsia="uz-Cyrl-UZ"/>
         </w:rPr>
-        <w:t>21. The student must have passed the intermediate control type before the final control type for the relevant subject.</w:t>
+        <w:t>21. Talaba tegishli fan bo'yicha yakuniy nazorat turiga qadar oraliq nazorat turini topshirgan bo'lishi shart.</w:t>
       </w:r>
     </w:p>
     <w:p>
@@ -1880,8 +1860,7 @@
           <w:szCs w:val="24"/>
           <w:lang w:eastAsia="uz-Cyrl-UZ"/>
         </w:rPr>
-        <w:lastRenderedPageBreak/>
-        <w:t>22. A student who has not passed the intermediate examination, as well as who has received a grade of "2" (unsatisfactory) for this examination, will not be admitted to the final examination.</w:t>
+        <w:t>22. Oraliq nazoratni topshirmagan, shuningdek ushbu nazorat bo'yicha "2" (qoniqarsiz) baho olgan talaba yakuniy nazoratga kiritilmaydi.</w:t>
       </w:r>
     </w:p>
     <w:p>
@@ -1907,7 +1886,7 @@
           <w:szCs w:val="24"/>
           <w:lang w:eastAsia="uz-Cyrl-UZ"/>
         </w:rPr>
-        <w:t>A student who has not participated in or is not included in the final type of control, as well as who has received a grade of "2" (unsatisfactory) for this type of control, is considered to be in academic debt.</w:t>
+        <w:t>Yakuniy nazorat turiga qatnashmagan yoki kiritilmagan, shuningdek ushbu nazorat turi bo'yicha "2" (qoniqarsiz) baho olgan talaba akademik qarzdor hisoblanadi.</w:t>
       </w:r>
     </w:p>
     <w:p>
@@ -1933,7 +1912,7 @@
           <w:szCs w:val="24"/>
           <w:lang w:eastAsia="uz-Cyrl-UZ"/>
         </w:rPr>
-        <w:t>23. If a student fails to pass the intermediate and (or) final examination for good reasons, this student is allowed to retake the relevant examination by order of the dean of the faculty.</w:t>
+        <w:t>23. Talaba uzrli sabablar tufayli oraliq va (yoki) yakuniy nazoratni topshira olmagan taqdirda, ushbu talabaga tegishli nazoratni qayta topshirishga fakultet dekani buyrug'i bilan ruxsat beriladi.</w:t>
       </w:r>
     </w:p>
     <w:p>
@@ -1959,7 +1938,7 @@
           <w:szCs w:val="24"/>
           <w:lang w:eastAsia="uz-Cyrl-UZ"/>
         </w:rPr>
-        <w:t>24. It is not allowed to conduct the final control of more than 1 subject in one day. Final inspections should be scheduled at least 2 days apart.</w:t>
+        <w:t>24. Bir kunda 1 dan ortiq fan bo'yicha yakuniy nazorat o'tkazishga yo'l qo'yilmaydi. Yakuniy nazoratlar kamida 2 kun oralab belgilanishi lozim.</w:t>
       </w:r>
     </w:p>
     <w:p>
@@ -1985,7 +1964,7 @@
           <w:szCs w:val="24"/>
           <w:lang w:eastAsia="uz-Cyrl-UZ"/>
         </w:rPr>
-        <w:t>25. In cases where non-graduate students have academic debt in up to 3 subjects (subjects) based on the results of the fall semester, the student is given up to one month, and a student with academic debt in up to 3 subjects (subjects) based on the results of the spring semester is given 1 month to retake the intermediate and (or) final tests in the relevant subject (subjects) from the beginning of the new academic year.</w:t>
+        <w:t>25. Kuz semestri natijalari bo'yicha 3 tagacha fanda (fanlarda) akademik qarzi bo'lgan bitiruvchi bo'lmagan talabaga bir oygacha, bahor semestri natijalari bo'yicha 3 tagacha fanda (fanlarda) akademik qarzi bo'lgan talabaga yangi o'quv yili boshidan 1 oy muddatda tegishli fanda (fanlarda) oraliq va (yoki) yakuniy nazoratlarni qayta topshirish uchun muddat beriladi.</w:t>
       </w:r>
     </w:p>
     <w:p>
@@ -2011,7 +1990,7 @@
           <w:szCs w:val="24"/>
           <w:lang w:eastAsia="uz-Cyrl-UZ"/>
         </w:rPr>
-        <w:t>Graduate students are allowed to retake the subject(s) they did not master according to the results of the spring semester until the beginning of the final state certification.</w:t>
+        <w:t>Bitiruvchi talabalar bahor semestri natijalari bo'yicha o'zlashtirilmagan fanni (fanlarni) yakuniy davlat attestatsiyasi boshlanishiga qadar qayta topshirishga ruxsat etiladi.</w:t>
       </w:r>
     </w:p>
     <w:p>
@@ -2037,7 +2016,7 @@
           <w:szCs w:val="24"/>
           <w:lang w:eastAsia="uz-Cyrl-UZ"/>
         </w:rPr>
-        <w:t>Students with academic debt in subjects of 4 or more are not allowed to retake and are dropped from the course by order of the rector (head, branch director) of the higher education institution.</w:t>
+        <w:t>4 va undan ortiq fanlarda akademik qarzi bo'lgan talabalar qayta topshirishga yo'l qo'yilmaydi va oliy ta'lim muassasasi rektori (boshlig'i, filial direktori) buyrug'i bilan kursdan chetlashtiriladi.</w:t>
       </w:r>
     </w:p>
     <w:p>
@@ -2063,7 +2042,7 @@
           <w:szCs w:val="24"/>
           <w:lang w:eastAsia="uz-Cyrl-UZ"/>
         </w:rPr>
-        <w:t>26. During the period given to the student to retake the intermediate and (or) final examination, the number of retakes by the student should not exceed 2.</w:t>
+        <w:t>26. Talabaga oraliq va (yoki) yakuniy nazoratni qayta topshirish uchun berilgan muddatda talabaning qayta topshirishlari soni 2 martadan oshmasligi kerak.</w:t>
       </w:r>
     </w:p>
     <w:p>
@@ -2089,7 +2068,7 @@
           <w:szCs w:val="24"/>
           <w:lang w:eastAsia="uz-Cyrl-UZ"/>
         </w:rPr>
-        <w:t>If a student fails the first retake of the intermediate and (or) final examination, a commission is formed by the dean of the faculty. The commission is formed from among professors and teachers of the relevant discipline and specialists in the field.</w:t>
+        <w:t>Agar talaba oraliq va (yoki) yakuniy nazoratni birinchi marta qayta topshirishda o'zlashtira olmasa, fakultet dekani tomonidan komissiya tuziladi. Komissiya tegishli fan professor-o'qituvchilari va soha mutaxassislari orasidan shakllantiriladi.</w:t>
       </w:r>
     </w:p>
     <w:p>
@@ -2115,7 +2094,7 @@
           <w:szCs w:val="24"/>
           <w:lang w:eastAsia="uz-Cyrl-UZ"/>
         </w:rPr>
-        <w:t>The second round of mid-term and (or) final control and student assessment will be carried out by this commission.</w:t>
+        <w:t>Oraliq va (yoki) yakuniy nazoratning ikkinchi qayta topshirilishi va talaba bilimini baholash ushbu komissiya tomonidan amalga oshiriladi.</w:t>
       </w:r>
     </w:p>
     <w:p>
@@ -2141,7 +2120,7 @@
           <w:szCs w:val="24"/>
           <w:lang w:eastAsia="uz-Cyrl-UZ"/>
         </w:rPr>
-        <w:t>27. For a student who fails to pay off the outstanding debt within the specified period, the dean of the faculty shall notify the rector (head, branch director) of the higher education institution with a statement, and this student shall be dismissed from the course by order of the rector (head, branch director).</w:t>
+        <w:t>27. Belgilangan muddatda akademik qarzni uzishga erishmagan talaba haqida fakultet dekani ariza bilan oliy ta'lim muassasasi rektori (boshlig'i, filial direktori)ga xabar qiladi va ushbu talaba rektor (boshlig', filial direktori) buyrug'i bilan kursdan chetlashtiriladi.</w:t>
       </w:r>
     </w:p>
     <w:p>
@@ -2167,8 +2146,7 @@
           <w:szCs w:val="24"/>
           <w:lang w:eastAsia="uz-Cyrl-UZ"/>
         </w:rPr>
-        <w:lastRenderedPageBreak/>
-        <w:t>28. If a student does not participate in the internship without good reason, and also receives a grade of "2" (unsatisfactory) based on the results of the internship, he/she is considered an academic debtor and is dropped from the course.</w:t>
+        <w:t>28. Talaba uzrli sababsiz amaliyotga qatnashmasa, shuningdek amaliyot natijalari bo'yicha "2" (qoniqarsiz) baho olsa, u akademik qarzdor hisoblanadi va kursdan chetlashtiriladi.</w:t>
       </w:r>
     </w:p>
     <w:p>
@@ -2194,7 +2172,7 @@
           <w:szCs w:val="24"/>
           <w:lang w:eastAsia="uz-Cyrl-UZ"/>
         </w:rPr>
-        <w:t>29. From the beginning of the semester in which the student has not mastered the subject(s), the student who is left in the course will continue to study according to the approved curriculum for the relevant semester of this academic year on a fee-contract basis.</w:t>
+        <w:t>29. Fanni (fanlarni) o'zlashtiramagan kursda qoldirilgan talaba o'sha fanni (fanlarni) o'zlashtiramagan semestri boshidan ushbu o'quv yilining tegishli semestri uchun tasdiqlangan o'quv rejasiga muvofiq to'lov-shartnoma asosida o'qishni davom ettiradi.</w:t>
       </w:r>
     </w:p>
     <w:p>
@@ -2220,7 +2198,7 @@
           <w:szCs w:val="24"/>
           <w:lang w:eastAsia="uz-Cyrl-UZ"/>
         </w:rPr>
-        <w:t>30. Students who are dissatisfied with the result of the assessment have the right to appeal to the Appeals Commission established by the dean of the faculty.</w:t>
+        <w:t>30. Baholash natijasidan qoniqmagan talabalar fakultet dekani tomonidan tashkil etilgan Apellyatsiya komissiyasiga murojaat qilish huquqiga ega.</w:t>
       </w:r>
     </w:p>
     <w:p>
@@ -2246,7 +2224,7 @@
           <w:szCs w:val="24"/>
           <w:lang w:eastAsia="uz-Cyrl-UZ"/>
         </w:rPr>
-        <w:t>31. The chairman of the commission and at least four members from among professors and teachers of relevant subjects who did not participate in the evaluation of the student are included in the appeal commission.</w:t>
+        <w:t>31. Apellyatsiya komissiyasiga komissiya raisi va talabani baholashda qatnashmagan tegishli fanlar professor-o'qituvchilaridan kamida to'rt a'zo kiritiladi.</w:t>
       </w:r>
     </w:p>
     <w:p>
@@ -2272,7 +2250,7 @@
           <w:szCs w:val="24"/>
           <w:lang w:eastAsia="uz-Cyrl-UZ"/>
         </w:rPr>
-        <w:t>32. If the student is dissatisfied with the evaluation result, he can file an appeal within 24 hours from the announcement of the evaluation result. The appeal submitted by the student must be considered by the Appeals Commission within 2 days.</w:t>
+        <w:t>32. Talaba baholash natijasidan qoniqmasa, baholash natijasi e'lon qilingan vaqtdan boshlab 24 soat ichida apellyatsiya arizasi berishi mumkin. Talaba tomonidan berilgan apellyatsiya arizasi Apellyatsiya komissiyasi tomonidan 2 kun ichida ko'rib chiqilishi kerak.</w:t>
       </w:r>
     </w:p>
     <w:p>
@@ -2298,7 +2276,7 @@
           <w:szCs w:val="24"/>
           <w:lang w:eastAsia="uz-Cyrl-UZ"/>
         </w:rPr>
-        <w:t>33. The student has the right to participate in the consideration of the student's appeal.</w:t>
+        <w:t>33. Talaba o'z apellyatsiyasini ko'rib chiqishda qatnashish huquqiga ega.</w:t>
       </w:r>
     </w:p>
     <w:p>
@@ -2324,7 +2302,7 @@
           <w:szCs w:val="24"/>
           <w:lang w:eastAsia="uz-Cyrl-UZ"/>
         </w:rPr>
-        <w:t>34. The appeals committee shall consider the student's appeal and make a decision on its outcome. The decision shall indicate whether the student has mastered or failed to master the relevant subject.</w:t>
+        <w:t>34. Apellyatsiya komissiyasi talabaning apellyatsiyasini ko'rib chiqadi va uning natijasi bo'yicha qaror qabul qiladi. Qarorda talabaning tegishli fanni o'zlashtirgan yoki o'zlashtiramagan ekanligi ko'rsatiladi.</w:t>
       </w:r>
     </w:p>
     <w:p>
@@ -2350,7 +2328,7 @@
           <w:szCs w:val="24"/>
           <w:lang w:eastAsia="uz-Cyrl-UZ"/>
         </w:rPr>
-        <w:t>The appeals commission ensures that the relevant decision is communicated to the dean of the faculty and the student.</w:t>
+        <w:t>Apellyatsiya komissiyasi tegishli qarorning fakultet dekani va talabaga yetkazilishini ta'minlaydi.</w:t>
       </w:r>
     </w:p>
     <w:p>
@@ -2379,7 +2357,7 @@
           <w:szCs w:val="24"/>
           <w:lang w:eastAsia="uz-Cyrl-UZ"/>
         </w:rPr>
-        <w:t>Chapter 4. Recording of assessment results</w:t>
+        <w:t>4-bob. Baholash natijalarini qayd etish</w:t>
       </w:r>
     </w:p>
     <w:p>
@@ -2405,7 +2383,7 @@
           <w:szCs w:val="24"/>
           <w:lang w:eastAsia="uz-Cyrl-UZ"/>
         </w:rPr>
-        <w:t>35. Assessment of students' knowledge is recorded by the professor-teacher in the relevant subject in the Journal of Recording Students' Mastery of Subjects (hereinafter referred to as the Journal). The professor-teacher may additionally conduct assessment of students' knowledge in an electronic system.</w:t>
+        <w:t>35. Talabalar bilimini baholash professor-o'qituvchi tomonidan tegishli fan bo'yicha Talabalarning fanlarni o'zlashtirish holatini qayd etish jurnalida (keyingi o'rinlarda — Jurnal) qayd etiladi. Professor-o'qituvchi talabalar bilimini qo'shimcha ravishda elektron tizimda baholashni amalga oshirishi mumkin.</w:t>
       </w:r>
     </w:p>
     <w:p>
@@ -2431,7 +2409,7 @@
           <w:szCs w:val="24"/>
           <w:lang w:eastAsia="uz-Cyrl-UZ"/>
         </w:rPr>
-        <w:t>The professor-teacher records the marks given to the student in the Journal on the same day. If the evaluation of the student's knowledge was conducted in the form of a written work, then the professor-teacher should record the results of the students in the journal within 3 days.</w:t>
+        <w:t>Professor-o'qituvchi talabaga qo'yilgan baholarni Jurnalga o'sha kuni qayd etadi. Agar talaba bilimini baholash yozma ish shaklida o'tkazilgan bo'lsa, professor-o'qituvchi talabalar natijalarini 3 kun ichida jurnalga qayd etishi lozim.</w:t>
       </w:r>
     </w:p>
     <w:p>
@@ -2457,7 +2435,7 @@
           <w:szCs w:val="24"/>
           <w:lang w:eastAsia="uz-Cyrl-UZ"/>
         </w:rPr>
-        <w:t>36. If a student's knowledge is assessed with a grade of "3" (satisfactory) or "4" (good) or "5" (excellent) in a type of control, retaking the type of control is not allowed.</w:t>
+        <w:t>36. Nazorat turida talaba bilimi "3" (qoniqarli) yoki "4" (yaxshi) yoki "5" (a'lo) baho bilan baholangan taqdirda, nazorat turini qayta topshirishga ruxsat etilmaydi.</w:t>
       </w:r>
     </w:p>
     <w:p>
@@ -2483,7 +2461,7 @@
           <w:szCs w:val="24"/>
           <w:lang w:eastAsia="uz-Cyrl-UZ"/>
         </w:rPr>
-        <w:t>37. In cases where a student does not participate without a valid reason at the time of the control type, the sign "0" is written in the journal.</w:t>
+        <w:t>37. Nazorat turi o'tkaziladigan vaqtda talaba uzrli sababsiz qatnashmagan taqdirda jurnalga "0" belgisi qo'yiladi.</w:t>
       </w:r>
     </w:p>
     <w:p>
@@ -2509,8 +2487,7 @@
           <w:szCs w:val="24"/>
           <w:lang w:eastAsia="uz-Cyrl-UZ"/>
         </w:rPr>
-        <w:lastRenderedPageBreak/>
-        <w:t>38. The journal is signed by the professor-teacher who conducted the training sessions in the relevant subject, the head of the department, and the dean of the faculty and is kept in the dean's office of the faculty. The dean of the faculty is responsible for the preservation of the journal.</w:t>
+        <w:t>38. Jurnal tegishli fanda o'quv mashg'ulotlarini olib borgan professor-o'qituvchi, kafedra mudiri va fakultet dekani tomonidan imzolanadi va fakultet dekanatida saqlanadi. Jurnalning saqlanishi uchun fakultet dekani javobgardir.</w:t>
       </w:r>
     </w:p>
     <w:p>
@@ -2536,7 +2513,7 @@
           <w:szCs w:val="24"/>
           <w:lang w:eastAsia="uz-Cyrl-UZ"/>
         </w:rPr>
-        <w:t>39. When students' final assessment grades are recorded in the Journal, they must also be recorded in the student's Gradebook on the same day.</w:t>
+        <w:t>39. Jurnalda talabalarning yakuniy baholash baholari qayd etilganda, ular o'sha kuni talabaning Baholar kitobchasida ham qayd etilishi shart.</w:t>
       </w:r>
     </w:p>
     <w:p>
@@ -2562,7 +2539,7 @@
           <w:szCs w:val="24"/>
           <w:lang w:eastAsia="uz-Cyrl-UZ"/>
         </w:rPr>
-        <w:t>40. In cases where a student's knowledge is assessed with a grade of "2" (unsatisfactory) or a mark of "0" is entered in the Journal during the final type of control, this grade or mark is not recorded in the student's Gradebook.</w:t>
+        <w:t>40. Yakuniy nazorat turi davomida talaba bilimi "2" (qoniqarsiz) baho bilan baholangan yoki Jurnalga "0" belgisi qo'yilgan hollarda, ushbu baho yoki belgi talabaning Baholar kitobchasiga qayd etilmaydi.</w:t>
       </w:r>
     </w:p>
     <w:p>
@@ -2588,7 +2565,7 @@
           <w:szCs w:val="24"/>
           <w:lang w:eastAsia="uz-Cyrl-UZ"/>
         </w:rPr>
-        <w:t>41. The dean of the faculty and the professor-teacher of the relevant subject are responsible for the timely, correct and complete maintenance of the magazine, as well as for not making unreasonable changes to the grades and other information in it.</w:t>
+        <w:t>41. Jurnalning o'z vaqtida, to'g'ri va to'liq yuritilishi, shuningdek undagi baholar va boshqa ma'lumotlarga asossiz o'zgartirishlar kiritilmasligi uchun fakultet dekani va tegishli fan professor-o'qituvchisi javobgardir.</w:t>
       </w:r>
     </w:p>
     <w:p>
@@ -2614,7 +2591,7 @@
           <w:szCs w:val="24"/>
           <w:lang w:eastAsia="uz-Cyrl-UZ"/>
         </w:rPr>
-        <w:t>42. A student who has received a grade of "3" (satisfactory) or "4" (good) or "5" (excellent) in subjects in the working curriculum at the end of the relevant academic year is transferred to the next year by order of the rector (head, branch director) of the higher education institution.</w:t>
+        <w:t>42. Tegishli o'quv yili oxirida ishchi o'quv rejasidagi fanlar bo'yicha "3" (qoniqarli) yoki "4" (yaxshi) yoki "5" (a'lo) baho olgan talaba oliy ta'lim muassasasi rektori (boshlig'i, filial direktori) buyrug'i bilan keyingi kursga o'tkaziladi.</w:t>
       </w:r>
     </w:p>
     <w:p>
@@ -2640,7 +2617,7 @@
           <w:szCs w:val="24"/>
           <w:lang w:eastAsia="uz-Cyrl-UZ"/>
         </w:rPr>
-        <w:t>43. Evaluation results are regularly discussed at department meetings, faculty and higher education organization councils, and appropriate decisions are made.</w:t>
+        <w:t>43. Baholash natijalari muntazam ravishda kafedra yig'ilishlarida, fakultet va oliy ta'lim tashkiloti kengashlarida muhokama qilinadi va tegishli qarorlar qabul qilinadi.</w:t>
       </w:r>
     </w:p>
     <w:p>
@@ -2666,7 +2643,7 @@
           <w:szCs w:val="24"/>
           <w:lang w:eastAsia="uz-Cyrl-UZ"/>
         </w:rPr>
-        <w:t xml:space="preserve">44. The system of assessing student learning in higher education institutions of the Republic of Uzbekistan shall be compared and transferred to the 5-point or 100-point system and the assessment system used in the higher education systems of advanced foreign countries based on the tables in accordance with </w:t>
+        <w:t>44. O'zbekiston Respublikasi oliy ta'lim muassasalarida talabalar bilimini baholash tizimi mazkur Nizomga ilova bo'yicha jadvallar asosida 5 balli yoki 100 balli tizimga va ilg'or xorijiy mamlakatlarning oliy ta'lim tizimlarida qo'llaniladigan baholash tizimiga solishtirilib o'tkaziladi.</w:t>
       </w:r>
       <w:hyperlink r:id="rId11" w:anchor="3920653" w:history="1">
         <w:r>
@@ -2689,7 +2666,6 @@
           <w:szCs w:val="24"/>
           <w:lang w:eastAsia="uz-Cyrl-UZ"/>
         </w:rPr>
-        <w:t xml:space="preserve"> to these Regulations .</w:t>
       </w:r>
     </w:p>
     <w:p>
@@ -2718,7 +2694,7 @@
           <w:szCs w:val="24"/>
           <w:lang w:eastAsia="uz-Cyrl-UZ"/>
         </w:rPr>
-        <w:t>Chapter 5. The final rule</w:t>
+        <w:t>5-bob. Yakuniy qoida</w:t>
       </w:r>
     </w:p>
     <w:p>
@@ -2744,7 +2720,7 @@
           <w:szCs w:val="24"/>
           <w:lang w:eastAsia="uz-Cyrl-UZ"/>
         </w:rPr>
-        <w:t>45. This Regulation has been agreed with the State Testing Center under the Cabinet of Ministers of the Republic of Uzbekistan, the Ministry of Public Education, the Education Quality Control Inspectorate under the Cabinet of Ministers, the Ministry of Health, the Ministry of Economy, the Ministry of Finance, the Ministry of Foreign Affairs, the Ministry of Development of Information Technologies and Communications, the Ministry of Culture, the Ministry of Physical Culture and Sports, the Ministry of Construction, the Uzbekistan Railways Joint-Stock Company, the State Committee for Roads, the Navoi Mining and Metallurgical Combine State Enterprise, the Academy of Arts of Uzbekistan, and the State Tax Committee.</w:t>
+        <w:t>45. Mazkur Nizom O'zbekiston Respublikasi Vazirlar Mahkamasi huzuridagi Davlat test markazi, Xalq ta'limi vazirligi, Vazirlar Mahkamasi huzuridagi Ta'lim sifatini nazorat qilish inspeksiyasi, Sog'liqni saqlash vazirligi, Iqtisodiyot vazirligi, Moliya vazirligi, Tashqi ishlar vazirligi, Axborot texnologiyalari va kommunikatsiyalarini rivojlantirish vazirligi, Madaniyat vazirligi, Jismoniy tarbiya va sport vazirligi, Qurilish vazirligi, "O'zbekiston temir yo'llari" aksiyadorlik jamiyati, Davlat avtomobil yo'llari qo'mitasi, "Navoiy kon-metallurgiya kombinati" davlat korxonasi, O'zbekiston San'at akademiyasi va Davlat soliq qo'mitasi bilan kelishilgan.</w:t>
       </w:r>
     </w:p>
     <w:tbl>
@@ -2808,8 +2784,13 @@
                 <w:szCs w:val="24"/>
                 <w:lang w:eastAsia="uz-Cyrl-UZ"/>
               </w:rPr>
-              <w:lastRenderedPageBreak/>
-              <w:t xml:space="preserve">APPENDIX </w:t>
+              <w:t>Oliy ta'lim tashkilotlarida talabalar bilimini nazorat qilish va baholash tizimi to'g'risidagi nizomga ILOVA</w:t>
+              <w:br/>
+              <w:br/>
+              <w:t>1-jadval</w:t>
+              <w:br/>
+              <w:br/>
+              <w:t>O'zbekiston Respublikasi oliy ta'lim muassasalarida talabalar bilimini baholash tizimini 5 balli va 100 balli tizimlarga solishtirish</w:t>
             </w:r>
             <w:hyperlink r:id="rId12" w:anchor="7331339" w:history="1">
               <w:r>
@@ -2832,7 +2813,6 @@
                 <w:szCs w:val="24"/>
                 <w:lang w:eastAsia="uz-Cyrl-UZ"/>
               </w:rPr>
-              <w:t xml:space="preserve"> on the system of monitoring and evaluating student knowledge in higher education institutions</w:t>
             </w:r>
             <w:r>
               <w:rPr>
@@ -2842,7 +2822,6 @@
                 <w:szCs w:val="24"/>
                 <w:lang w:eastAsia="uz-Cyrl-UZ"/>
               </w:rPr>
-              <w:br/>
             </w:r>
             <w:r>
               <w:rPr>
@@ -2854,7 +2833,6 @@
                 <w:szCs w:val="24"/>
                 <w:lang w:eastAsia="uz-Cyrl-UZ"/>
               </w:rPr>
-              <w:t>Table 1</w:t>
             </w:r>
           </w:p>
           <w:p>
@@ -2879,7 +2857,13 @@
                 <w:szCs w:val="24"/>
                 <w:lang w:eastAsia="uz-Cyrl-UZ"/>
               </w:rPr>
-              <w:t>Changing the rating from a 5-point scale to a 100-point scale</w:t>
+              <w:t>Oliy ta'lim tashkilotlarida talabalar bilimini nazorat qilish va baholash tizimi to'g'risidagi nizomga ILOVA</w:t>
+              <w:br/>
+              <w:br/>
+              <w:t>1-jadval</w:t>
+              <w:br/>
+              <w:br/>
+              <w:t>O'zbekiston Respublikasi oliy ta'lim muassasalarida talabalar bilimini baholash tizimini 5 balli va 100 balli tizimlarga solishtirish</w:t>
             </w:r>
           </w:p>
           <w:p>
@@ -2904,7 +2888,13 @@
                 <w:szCs w:val="24"/>
                 <w:lang w:eastAsia="uz-Cyrl-UZ"/>
               </w:rPr>
-              <w:t>TABLE</w:t>
+              <w:t>Oliy ta'lim tashkilotlarida talabalar bilimini nazorat qilish va baholash tizimi to'g'risidagi nizomga ILOVA</w:t>
+              <w:br/>
+              <w:br/>
+              <w:t>1-jadval</w:t>
+              <w:br/>
+              <w:br/>
+              <w:t>O'zbekiston Respublikasi oliy ta'lim muassasalarida talabalar bilimini baholash tizimini 5 balli va 100 balli tizimlarga solishtirish</w:t>
             </w:r>
           </w:p>
         </w:tc>
@@ -2950,7 +2940,7 @@
                 <w:szCs w:val="24"/>
                 <w:lang w:eastAsia="uz-Cyrl-UZ"/>
               </w:rPr>
-              <w:t>5-point scale</w:t>
+              <w:t>5 balli shkala</w:t>
             </w:r>
           </w:p>
         </w:tc>
@@ -2994,7 +2984,7 @@
                 <w:szCs w:val="24"/>
                 <w:lang w:eastAsia="uz-Cyrl-UZ"/>
               </w:rPr>
-              <w:t>100-point scale</w:t>
+              <w:t>100 balli shkala</w:t>
             </w:r>
           </w:p>
         </w:tc>
@@ -3070,7 +3060,7 @@
                 <w:szCs w:val="24"/>
                 <w:lang w:eastAsia="uz-Cyrl-UZ"/>
               </w:rPr>
-              <w:t>5-point scale</w:t>
+              <w:t>5 balli shkala</w:t>
             </w:r>
           </w:p>
         </w:tc>
@@ -3115,7 +3105,7 @@
                 <w:szCs w:val="24"/>
                 <w:lang w:eastAsia="uz-Cyrl-UZ"/>
               </w:rPr>
-              <w:t>100-point scale</w:t>
+              <w:t>100 balli shkala</w:t>
             </w:r>
           </w:p>
         </w:tc>
@@ -3192,7 +3182,7 @@
                 <w:szCs w:val="24"/>
                 <w:lang w:eastAsia="uz-Cyrl-UZ"/>
               </w:rPr>
-              <w:t>5-point scale</w:t>
+              <w:t>5 balli shkala</w:t>
             </w:r>
           </w:p>
         </w:tc>
@@ -3236,7 +3226,7 @@
                 <w:szCs w:val="24"/>
                 <w:lang w:eastAsia="uz-Cyrl-UZ"/>
               </w:rPr>
-              <w:t>100-point scale</w:t>
+              <w:t>100 balli shkala</w:t>
             </w:r>
           </w:p>
         </w:tc>
@@ -7508,7 +7498,7 @@
                 <w:szCs w:val="24"/>
                 <w:lang w:eastAsia="uz-Cyrl-UZ"/>
               </w:rPr>
-              <w:t>Less than 3.0</w:t>
+              <w:t>3.0 dan kam</w:t>
             </w:r>
           </w:p>
         </w:tc>
@@ -7552,7 +7542,7 @@
                 <w:szCs w:val="24"/>
                 <w:lang w:eastAsia="uz-Cyrl-UZ"/>
               </w:rPr>
-              <w:t>Less than 60</w:t>
+              <w:t>60 dan kam</w:t>
             </w:r>
           </w:p>
         </w:tc>
@@ -7602,7 +7592,10 @@
                 <w:szCs w:val="24"/>
                 <w:lang w:eastAsia="uz-Cyrl-UZ"/>
               </w:rPr>
+              <w:t>2-jadval</w:t>
               <w:br/>
+              <w:br/>
+              <w:t>OLIY TA'LIM MUASSASALARIDA TALABALAR BILIMINI BAHOLASH TIZIMLARINI QIYOSIY TAQQOSLASH</w:t>
             </w:r>
             <w:r>
               <w:rPr>
@@ -7614,7 +7607,6 @@
                 <w:szCs w:val="24"/>
                 <w:lang w:eastAsia="uz-Cyrl-UZ"/>
               </w:rPr>
-              <w:br/>
             </w:r>
           </w:p>
           <w:p>
@@ -7719,8 +7711,10 @@
                 <w:szCs w:val="24"/>
                 <w:lang w:eastAsia="uz-Cyrl-UZ"/>
               </w:rPr>
-              <w:lastRenderedPageBreak/>
-              <w:t>Table 2</w:t>
+              <w:t>2-jadval</w:t>
+              <w:br/>
+              <w:br/>
+              <w:t>OLIY TA'LIM MUASSASALARIDA TALABALAR BILIMINI BAHOLASH TIZIMLARINI QIYOSIY TAQQOSLASH</w:t>
             </w:r>
           </w:p>
           <w:p>
@@ -7745,8 +7739,10 @@
                 <w:szCs w:val="24"/>
                 <w:lang w:eastAsia="uz-Cyrl-UZ"/>
               </w:rPr>
+              <w:t>2-jadval</w:t>
               <w:br/>
-              <w:t>COMPARATIVE COMPARISON OF STUDENT ASSESSMENT ASSESSMENT SYSTEMS IN HIGHER EDUCATION</w:t>
+              <w:br/>
+              <w:t>OLIY TA'LIM MUASSASALARIDA TALABALAR BILIMINI BAHOLASH TIZIMLARINI QIYOSIY TAQQOSLASH</w:t>
             </w:r>
             <w:r>
               <w:rPr>
@@ -7758,7 +7754,6 @@
                 <w:szCs w:val="24"/>
                 <w:lang w:eastAsia="uz-Cyrl-UZ"/>
               </w:rPr>
-              <w:br/>
             </w:r>
             <w:r>
               <w:rPr>
@@ -7770,7 +7765,6 @@
                 <w:szCs w:val="24"/>
                 <w:lang w:eastAsia="uz-Cyrl-UZ"/>
               </w:rPr>
-              <w:br/>
             </w:r>
           </w:p>
         </w:tc>
@@ -7816,8 +7810,7 @@
                 <w:szCs w:val="24"/>
                 <w:lang w:eastAsia="uz-Cyrl-UZ"/>
               </w:rPr>
-              <w:lastRenderedPageBreak/>
-              <w:t>The proposed Uzbek system</w:t>
+              <w:t>Taklif etilayotgan O'zbekiston tizimi</w:t>
             </w:r>
           </w:p>
         </w:tc>
@@ -7861,7 +7854,9 @@
                 <w:szCs w:val="24"/>
                 <w:lang w:eastAsia="uz-Cyrl-UZ"/>
               </w:rPr>
-              <w:t>Russian system</w:t>
+              <w:t>Rossiya tizimi</w:t>
+              <w:br/>
+              <w:t>(MDU)*</w:t>
             </w:r>
           </w:p>
           <w:p>
@@ -7886,7 +7881,9 @@
                 <w:szCs w:val="24"/>
                 <w:lang w:eastAsia="uz-Cyrl-UZ"/>
               </w:rPr>
-              <w:t>(MSU)*</w:t>
+              <w:t>Rossiya tizimi</w:t>
+              <w:br/>
+              <w:t>(MDU)*</w:t>
             </w:r>
           </w:p>
         </w:tc>
@@ -7931,7 +7928,7 @@
                 <w:szCs w:val="24"/>
                 <w:lang w:eastAsia="uz-Cyrl-UZ"/>
               </w:rPr>
-              <w:t>European Credit Transfer System (ECTS — European Credit Transfer System)</w:t>
+              <w:t>Yevropa kredit transferi tizimi (ECTS — European Credit Transfer System)</w:t>
             </w:r>
           </w:p>
         </w:tc>
@@ -7975,7 +7972,9 @@
                 <w:szCs w:val="24"/>
                 <w:lang w:eastAsia="uz-Cyrl-UZ"/>
               </w:rPr>
-              <w:t>American system</w:t>
+              <w:t>Amerika tizimi</w:t>
+              <w:br/>
+              <w:t>(A-F)</w:t>
             </w:r>
           </w:p>
           <w:p>
@@ -8000,6 +7999,8 @@
                 <w:szCs w:val="24"/>
                 <w:lang w:eastAsia="uz-Cyrl-UZ"/>
               </w:rPr>
+              <w:t>Amerika tizimi</w:t>
+              <w:br/>
               <w:t>(A-F)</w:t>
             </w:r>
           </w:p>
@@ -8045,7 +8046,9 @@
                 <w:szCs w:val="24"/>
                 <w:lang w:eastAsia="uz-Cyrl-UZ"/>
               </w:rPr>
-              <w:t>British system</w:t>
+              <w:t>Britaniya tizimi</w:t>
+              <w:br/>
+              <w:t>(%)</w:t>
             </w:r>
           </w:p>
           <w:p>
@@ -8070,6 +8073,8 @@
                 <w:szCs w:val="24"/>
                 <w:lang w:eastAsia="uz-Cyrl-UZ"/>
               </w:rPr>
+              <w:t>Britaniya tizimi</w:t>
+              <w:br/>
               <w:t>(%)</w:t>
             </w:r>
           </w:p>
@@ -8114,7 +8119,9 @@
                 <w:szCs w:val="24"/>
                 <w:lang w:eastAsia="uz-Cyrl-UZ"/>
               </w:rPr>
-              <w:t>Japanese system</w:t>
+              <w:t>Yaponiya tizimi</w:t>
+              <w:br/>
+              <w:t>(%)</w:t>
             </w:r>
           </w:p>
           <w:p>
@@ -8139,6 +8146,8 @@
                 <w:szCs w:val="24"/>
                 <w:lang w:eastAsia="uz-Cyrl-UZ"/>
               </w:rPr>
+              <w:t>Yaponiya tizimi</w:t>
+              <w:br/>
               <w:t>(%)</w:t>
             </w:r>
           </w:p>
@@ -8183,7 +8192,11 @@
                 <w:szCs w:val="24"/>
                 <w:lang w:eastAsia="uz-Cyrl-UZ"/>
               </w:rPr>
-              <w:t>Korean</w:t>
+              <w:t>Koreya</w:t>
+              <w:br/>
+              <w:t>tizimi</w:t>
+              <w:br/>
+              <w:t>(%)</w:t>
             </w:r>
             <w:r>
               <w:rPr>
@@ -8195,8 +8208,6 @@
                 <w:szCs w:val="24"/>
                 <w:lang w:eastAsia="uz-Cyrl-UZ"/>
               </w:rPr>
-              <w:br/>
-              <w:t>system</w:t>
             </w:r>
           </w:p>
           <w:p>
@@ -8221,6 +8232,10 @@
                 <w:szCs w:val="24"/>
                 <w:lang w:eastAsia="uz-Cyrl-UZ"/>
               </w:rPr>
+              <w:t>Koreya</w:t>
+              <w:br/>
+              <w:t>tizimi</w:t>
+              <w:br/>
               <w:t>(%)</w:t>
             </w:r>
           </w:p>
@@ -8265,7 +8280,11 @@
                 <w:szCs w:val="24"/>
                 <w:lang w:eastAsia="uz-Cyrl-UZ"/>
               </w:rPr>
-              <w:t>System of Uzbekistan</w:t>
+              <w:t>O'zbekiston</w:t>
+              <w:br/>
+              <w:t>tizimi</w:t>
+              <w:br/>
+              <w:t>(%)</w:t>
             </w:r>
           </w:p>
           <w:p>
@@ -8290,6 +8309,10 @@
                 <w:szCs w:val="24"/>
                 <w:lang w:eastAsia="uz-Cyrl-UZ"/>
               </w:rPr>
+              <w:t>O'zbekiston</w:t>
+              <w:br/>
+              <w:t>tizimi</w:t>
+              <w:br/>
               <w:t>(%)</w:t>
             </w:r>
           </w:p>

</xml_diff>